<commit_message>
docs(verifactu): update declaration evidence without enabling production
</commit_message>
<xml_diff>
--- a/docs/legal/Declaracion_responsable_LimpiaGest_VERIFACTU_BORRADOR.docx
+++ b/docs/legal/Declaracion_responsable_LimpiaGest_VERIFACTU_BORRADOR.docx
@@ -76,7 +76,7 @@
                 <w:color w:val="000000"/>
                 <w:sz w:val="22"/>
               </w:rPr>
-              <w:t>Este documento recoge las evidencias técnicas disponibles a 29/08/2026, pero no certifica el cierre legal. Antes de firmarlo deben completarse una nueva prueba limpia de subsanación, la revisión independiente y la versión comercial bloqueada exclusivamente en modalidad VERI*FACTU.</w:t>
+              <w:t>Evidencias actualizadas a 30/08/2026: alta, subsanación y anulación del caso TEST-VF-2026-0002 aceptadas sin errores. Esto no certifica el cierre legal. Quedan la revisión independiente y la versión comercial exclusiva VERI*FACTU. La producción permanece bloqueada.</w:t>
             </w:r>
           </w:p>
         </w:tc>
@@ -1633,7 +1633,7 @@
                 <w:color w:val="000000"/>
                 <w:sz w:val="19"/>
               </w:rPr>
-              <w:t>TEST-VF-2026-0001, 1,21 EUR: alta aceptada sin errores en un intento.</w:t>
+              <w:t>TEST-VF-2026-0002, 1,21 EUR: aceptada sin errores al primer intento. También se conserva el alta aceptada de TEST-VF-2026-0001.</w:t>
             </w:r>
           </w:p>
         </w:tc>
@@ -1680,10 +1680,10 @@
                 <w:rFonts w:ascii="Calibri" w:hAnsi="Calibri"/>
                 <w:b/>
                 <w:i w:val="0"/>
-                <w:color w:val="9B1C1C"/>
+                <w:color w:val="000000"/>
                 <w:sz w:val="19"/>
               </w:rPr>
-              <w:t>ACEPTADA CON AVISO</w:t>
+              <w:t>SUPERADO</w:t>
             </w:r>
           </w:p>
         </w:tc>
@@ -1707,7 +1707,7 @@
                 <w:color w:val="000000"/>
                 <w:sz w:val="19"/>
               </w:rPr>
-              <w:t>La AEAT aceptó la anulación en un intento y avisó de que su hora de generación superaba el margen de 240 segundos. El flujo ya bloquea futuros primeros envíos caducados.</w:t>
+              <w:t>TEST-VF-2026-0002: aceptada sin errores al primer intento. Totales facturado y pendiente: 0,00 EUR. Se conserva el historial; no se borraron registros ni se marcaron como cobrados.</w:t>
             </w:r>
           </w:p>
         </w:tc>
@@ -1754,10 +1754,10 @@
                 <w:rFonts w:ascii="Calibri" w:hAnsi="Calibri"/>
                 <w:b/>
                 <w:i w:val="0"/>
-                <w:color w:val="9B1C1C"/>
+                <w:color w:val="000000"/>
                 <w:sz w:val="19"/>
               </w:rPr>
-              <w:t>REPETIR</w:t>
+              <w:t>SUPERADO</w:t>
             </w:r>
           </w:p>
         </w:tc>
@@ -1781,7 +1781,7 @@
                 <w:color w:val="000000"/>
                 <w:sz w:val="19"/>
               </w:rPr>
-              <w:t>La prueba fue rechazada como registro duplicado porque faltó el indicador oficial. La generación se corrigió, ahora exige modificar un dato fiscal y se publicó en el commit de59240; falta validarla con un caso nuevo.</w:t>
+              <w:t>TEST-VF-2026-0002: aceptada sin errores al primer intento. Nombre corregido a CLIENTE PRUEBA SUBSANACION CORREGIDO; NIF e importes sin cambios. Corrección técnica de59240 validada.</w:t>
             </w:r>
           </w:p>
         </w:tc>

</xml_diff>